<commit_message>
MERLAS iş akım şemasını Dasblue taslak düzeninde sadeleştir.
Co-authored-by: iremalisan <iremalisan@users.noreply.github.com>
</commit_message>
<xml_diff>
--- a/MERLAS_Is_Akim_Semasi_ve_Proses_Ozeti.docx
+++ b/MERLAS_Is_Akim_Semasi_ve_Proses_Ozeti.docx
@@ -4,381 +4,387 @@
   <w:body>
     <w:p>
       <w:pPr>
-        <w:spacing w:before="0" w:after="40" w:line="240" w:lineRule="auto"/>
+        <w:spacing w:before="0" w:after="120" w:line="240" w:lineRule="auto"/>
         <w:jc w:val="center"/>
       </w:pPr>
       <w:r>
         <w:rPr>
-          <w:rFonts w:ascii="Calibri" w:hAnsi="Calibri" w:cs="Calibri" w:eastAsia="Calibri"/>
+          <w:rFonts w:ascii="Times New Roman" w:hAnsi="Times New Roman" w:cs="Times New Roman" w:eastAsia="Times New Roman"/>
           <w:b/>
-          <w:i w:val="0"/>
-          <w:color w:val="0F2A44"/>
-          <w:sz w:val="36"/>
+          <w:color w:val="000000"/>
+          <w:sz w:val="28"/>
         </w:rPr>
-        <w:t>İŞ AKIM ŞEMASI VE PROSES ÖZETİ</w:t>
+        <w:t>PROJE ÖZETİ</w:t>
+      </w:r>
+    </w:p>
+    <w:p>
+      <w:pPr>
+        <w:spacing w:before="80" w:after="40" w:line="240" w:lineRule="auto"/>
+        <w:jc w:val="center"/>
+      </w:pPr>
+      <w:r>
+        <w:rPr>
+          <w:rFonts w:ascii="Times New Roman" w:hAnsi="Times New Roman" w:cs="Times New Roman" w:eastAsia="Times New Roman"/>
+          <w:b/>
+          <w:color w:val="000000"/>
+          <w:sz w:val="24"/>
+        </w:rPr>
+        <w:t>1. TESİSİN YERİ</w:t>
+      </w:r>
+    </w:p>
+    <w:p>
+      <w:pPr>
+        <w:spacing w:before="0" w:after="60" w:line="240" w:lineRule="auto"/>
+        <w:jc w:val="both"/>
+      </w:pPr>
+      <w:r>
+        <w:rPr>
+          <w:rFonts w:ascii="Times New Roman" w:hAnsi="Times New Roman" w:cs="Times New Roman" w:eastAsia="Times New Roman"/>
+          <w:b w:val="0"/>
+          <w:color w:val="000000"/>
+          <w:sz w:val="24"/>
+        </w:rPr>
+        <w:t>Mersin İli, Akdeniz İlçesi, Dikilitaş Mahallesi, 22226 Sokak, No: 4 A, İç Kapı No: 1 adresinde, tapunun 4 ada 4 parseli üzerinde, net 7.500 m² alanda, MERLAS Oto Lastik Endüstri Sanayi ve Ticaret Limited Şirketi olarak motorlu kara taşıtı lastiklerinin ve jantlarının toptan ticareti yapılmaktadır. İşletme bu adreste mülk sahibi olarak bulunmaktadır.</w:t>
+      </w:r>
+    </w:p>
+    <w:p>
+      <w:pPr>
+        <w:spacing w:before="120" w:after="40" w:line="240" w:lineRule="auto"/>
+        <w:jc w:val="center"/>
+      </w:pPr>
+      <w:r>
+        <w:rPr>
+          <w:rFonts w:ascii="Times New Roman" w:hAnsi="Times New Roman" w:cs="Times New Roman" w:eastAsia="Times New Roman"/>
+          <w:b/>
+          <w:color w:val="000000"/>
+          <w:sz w:val="24"/>
+        </w:rPr>
+        <w:t>2. PROJENİN TÜRÜ</w:t>
+      </w:r>
+    </w:p>
+    <w:p>
+      <w:pPr>
+        <w:spacing w:before="20" w:after="20" w:line="240" w:lineRule="auto"/>
+        <w:jc w:val="both"/>
+      </w:pPr>
+      <w:r>
+        <w:rPr>
+          <w:rFonts w:ascii="Times New Roman" w:hAnsi="Times New Roman" w:cs="Times New Roman" w:eastAsia="Times New Roman"/>
+          <w:b/>
+          <w:color w:val="000000"/>
+          <w:sz w:val="24"/>
+        </w:rPr>
+        <w:t xml:space="preserve">- Tedarikçilerden Ürün Temini: </w:t>
+      </w:r>
+      <w:r>
+        <w:rPr>
+          <w:rFonts w:ascii="Times New Roman" w:hAnsi="Times New Roman" w:cs="Times New Roman" w:eastAsia="Times New Roman"/>
+          <w:b w:val="0"/>
+          <w:color w:val="000000"/>
+          <w:sz w:val="24"/>
+        </w:rPr>
+        <w:t>Faaliyet kapsamında motorlu kara taşıtlarına yönelik lastik ve jantlar, üretici firmalar veya yetkili tedarikçilerden temin edilmektedir.</w:t>
+      </w:r>
+    </w:p>
+    <w:p>
+      <w:pPr>
+        <w:spacing w:before="20" w:after="20" w:line="240" w:lineRule="auto"/>
+        <w:jc w:val="both"/>
+      </w:pPr>
+      <w:r>
+        <w:rPr>
+          <w:rFonts w:ascii="Times New Roman" w:hAnsi="Times New Roman" w:cs="Times New Roman" w:eastAsia="Times New Roman"/>
+          <w:b/>
+          <w:color w:val="000000"/>
+          <w:sz w:val="24"/>
+        </w:rPr>
+        <w:t xml:space="preserve">- Mal Kabul ve Kalite Kontrol: </w:t>
+      </w:r>
+      <w:r>
+        <w:rPr>
+          <w:rFonts w:ascii="Times New Roman" w:hAnsi="Times New Roman" w:cs="Times New Roman" w:eastAsia="Times New Roman"/>
+          <w:b w:val="0"/>
+          <w:color w:val="000000"/>
+          <w:sz w:val="24"/>
+        </w:rPr>
+        <w:t>Tesise gelen ürünler mal kabul ve kalite kontrol işlemlerinden geçirilmektedir.</w:t>
+      </w:r>
+    </w:p>
+    <w:p>
+      <w:pPr>
+        <w:spacing w:before="20" w:after="20" w:line="240" w:lineRule="auto"/>
+        <w:jc w:val="both"/>
+      </w:pPr>
+      <w:r>
+        <w:rPr>
+          <w:rFonts w:ascii="Times New Roman" w:hAnsi="Times New Roman" w:cs="Times New Roman" w:eastAsia="Times New Roman"/>
+          <w:b/>
+          <w:color w:val="000000"/>
+          <w:sz w:val="24"/>
+        </w:rPr>
+        <w:t xml:space="preserve">- Depolama ve Stok Takibi: </w:t>
+      </w:r>
+      <w:r>
+        <w:rPr>
+          <w:rFonts w:ascii="Times New Roman" w:hAnsi="Times New Roman" w:cs="Times New Roman" w:eastAsia="Times New Roman"/>
+          <w:b w:val="0"/>
+          <w:color w:val="000000"/>
+          <w:sz w:val="24"/>
+        </w:rPr>
+        <w:t>Kontrolden geçen ürünler depolanmaktadır.</w:t>
+      </w:r>
+    </w:p>
+    <w:p>
+      <w:pPr>
+        <w:spacing w:before="20" w:after="20" w:line="240" w:lineRule="auto"/>
+        <w:jc w:val="both"/>
+      </w:pPr>
+      <w:r>
+        <w:rPr>
+          <w:rFonts w:ascii="Times New Roman" w:hAnsi="Times New Roman" w:cs="Times New Roman" w:eastAsia="Times New Roman"/>
+          <w:b/>
+          <w:color w:val="000000"/>
+          <w:sz w:val="24"/>
+        </w:rPr>
+        <w:t xml:space="preserve">- Sipariş Alınması ve Sipariş Hazırlama: </w:t>
+      </w:r>
+      <w:r>
+        <w:rPr>
+          <w:rFonts w:ascii="Times New Roman" w:hAnsi="Times New Roman" w:cs="Times New Roman" w:eastAsia="Times New Roman"/>
+          <w:b w:val="0"/>
+          <w:color w:val="000000"/>
+          <w:sz w:val="24"/>
+        </w:rPr>
+        <w:t>Müşterilerden alınan siparişler doğrultusunda ürünler stoktan hazırlanmakta, paketlenmekte ve sevkiyata hazır hale getirilmektedir.</w:t>
+      </w:r>
+    </w:p>
+    <w:p>
+      <w:pPr>
+        <w:spacing w:before="20" w:after="20" w:line="240" w:lineRule="auto"/>
+        <w:jc w:val="both"/>
+      </w:pPr>
+      <w:r>
+        <w:rPr>
+          <w:rFonts w:ascii="Times New Roman" w:hAnsi="Times New Roman" w:cs="Times New Roman" w:eastAsia="Times New Roman"/>
+          <w:b/>
+          <w:color w:val="000000"/>
+          <w:sz w:val="24"/>
+        </w:rPr>
+        <w:t xml:space="preserve">- Sevkiyat, Dağıtım ve Müşteriye Teslimat: </w:t>
+      </w:r>
+      <w:r>
+        <w:rPr>
+          <w:rFonts w:ascii="Times New Roman" w:hAnsi="Times New Roman" w:cs="Times New Roman" w:eastAsia="Times New Roman"/>
+          <w:b w:val="0"/>
+          <w:color w:val="000000"/>
+          <w:sz w:val="24"/>
+        </w:rPr>
+        <w:t>Ürünler toptan satış kapsamında bayi, servis, filo işletmeleri ve diğer ticari müşterilere ulaştırılmaktadır.</w:t>
+      </w:r>
+    </w:p>
+    <w:p>
+      <w:pPr>
+        <w:spacing w:before="20" w:after="20" w:line="240" w:lineRule="auto"/>
+        <w:jc w:val="both"/>
+      </w:pPr>
+      <w:r>
+        <w:rPr>
+          <w:rFonts w:ascii="Times New Roman" w:hAnsi="Times New Roman" w:cs="Times New Roman" w:eastAsia="Times New Roman"/>
+          <w:b/>
+          <w:color w:val="000000"/>
+          <w:sz w:val="24"/>
+        </w:rPr>
+        <w:t xml:space="preserve">- Satış Sonrası Destek ve İade İşlemleri: </w:t>
+      </w:r>
+      <w:r>
+        <w:rPr>
+          <w:rFonts w:ascii="Times New Roman" w:hAnsi="Times New Roman" w:cs="Times New Roman" w:eastAsia="Times New Roman"/>
+          <w:b w:val="0"/>
+          <w:color w:val="000000"/>
+          <w:sz w:val="24"/>
+        </w:rPr>
+        <w:t>Faaliyet sürecinde herhangi bir üretim işlemi bulunmamakta olup depolama, sipariş yönetimi, sevkiyat ve satış işlemleri gerçekleştirilmektedir.</w:t>
+      </w:r>
+    </w:p>
+    <w:p>
+      <w:pPr>
+        <w:spacing w:before="120" w:after="40" w:line="240" w:lineRule="auto"/>
+        <w:jc w:val="center"/>
+      </w:pPr>
+      <w:r>
+        <w:rPr>
+          <w:rFonts w:ascii="Times New Roman" w:hAnsi="Times New Roman" w:cs="Times New Roman" w:eastAsia="Times New Roman"/>
+          <w:b/>
+          <w:color w:val="000000"/>
+          <w:sz w:val="24"/>
+        </w:rPr>
+        <w:t>3. TESİSTE KAYNAKLANACAK SIVI ATIKLAR</w:t>
+      </w:r>
+    </w:p>
+    <w:p>
+      <w:pPr>
+        <w:spacing w:before="0" w:after="60" w:line="240" w:lineRule="auto"/>
+        <w:jc w:val="both"/>
+      </w:pPr>
+      <w:r>
+        <w:rPr>
+          <w:rFonts w:ascii="Times New Roman" w:hAnsi="Times New Roman" w:cs="Times New Roman" w:eastAsia="Times New Roman"/>
+          <w:b w:val="0"/>
+          <w:color w:val="000000"/>
+          <w:sz w:val="24"/>
+        </w:rPr>
+        <w:t>İşletmede şebeke suyu kullanılmaktadır. Tesiste kuyu suyu kullanımı vardır. Evsel atıksu için Atıksu Deşarj İzin Belgesi kapsamında MESKİ’ye başvuruda bulunulacaktır. Tesiste endüstriyel atıksu oluşmamaktadır.</w:t>
+      </w:r>
+    </w:p>
+    <w:p>
+      <w:pPr>
+        <w:spacing w:before="120" w:after="40" w:line="240" w:lineRule="auto"/>
+        <w:jc w:val="center"/>
+      </w:pPr>
+      <w:r>
+        <w:rPr>
+          <w:rFonts w:ascii="Times New Roman" w:hAnsi="Times New Roman" w:cs="Times New Roman" w:eastAsia="Times New Roman"/>
+          <w:b/>
+          <w:color w:val="000000"/>
+          <w:sz w:val="24"/>
+        </w:rPr>
+        <w:t>4. TESİSTE KAYNAKLANACAK EMİSYONLAR</w:t>
+      </w:r>
+    </w:p>
+    <w:p>
+      <w:pPr>
+        <w:spacing w:before="0" w:after="60" w:line="240" w:lineRule="auto"/>
+        <w:jc w:val="both"/>
+      </w:pPr>
+      <w:r>
+        <w:rPr>
+          <w:rFonts w:ascii="Times New Roman" w:hAnsi="Times New Roman" w:cs="Times New Roman" w:eastAsia="Times New Roman"/>
+          <w:b w:val="0"/>
+          <w:color w:val="000000"/>
+          <w:sz w:val="24"/>
+        </w:rPr>
+        <w:t>Tesiste emisyon kaynağı bulunmamaktadır. Kontrolsüz emisyon kaynağı gözlemlenmemiştir.</w:t>
+      </w:r>
+    </w:p>
+    <w:p>
+      <w:pPr>
+        <w:spacing w:before="120" w:after="40" w:line="240" w:lineRule="auto"/>
+        <w:jc w:val="center"/>
+      </w:pPr>
+      <w:r>
+        <w:rPr>
+          <w:rFonts w:ascii="Times New Roman" w:hAnsi="Times New Roman" w:cs="Times New Roman" w:eastAsia="Times New Roman"/>
+          <w:b/>
+          <w:color w:val="000000"/>
+          <w:sz w:val="24"/>
+        </w:rPr>
+        <w:t>5. TESİSTE KAYNAKLANACAK ATIKLAR</w:t>
       </w:r>
     </w:p>
     <w:p>
       <w:pPr>
         <w:spacing w:before="0" w:after="40" w:line="240" w:lineRule="auto"/>
-        <w:jc w:val="center"/>
+        <w:jc w:val="left"/>
       </w:pPr>
       <w:r>
         <w:rPr>
-          <w:rFonts w:ascii="Calibri" w:hAnsi="Calibri" w:cs="Calibri" w:eastAsia="Calibri"/>
-          <w:b/>
-          <w:i w:val="0"/>
-          <w:color w:val="0369A1"/>
-          <w:sz w:val="26"/>
+          <w:rFonts w:ascii="Times New Roman" w:hAnsi="Times New Roman" w:cs="Times New Roman" w:eastAsia="Times New Roman"/>
+          <w:b w:val="0"/>
+          <w:color w:val="000000"/>
+          <w:sz w:val="24"/>
         </w:rPr>
-        <w:t>MERLAS Oto Lastik Endüstri Sanayi ve Ticaret Limited Şirketi</w:t>
-      </w:r>
-    </w:p>
-    <w:p>
-      <w:pPr>
-        <w:spacing w:before="0" w:after="160" w:line="240" w:lineRule="auto"/>
-        <w:jc w:val="center"/>
-      </w:pPr>
-      <w:r>
-        <w:rPr>
-          <w:rFonts w:ascii="Calibri" w:hAnsi="Calibri" w:cs="Calibri" w:eastAsia="Calibri"/>
-          <w:b w:val="0"/>
-          <w:i w:val="0"/>
-          <w:color w:val="475569"/>
-          <w:sz w:val="22"/>
-        </w:rPr>
-        <w:t>Motorlu kara taşıtı lastiklerinin ve jantlarının toptan ticareti</w:t>
-      </w:r>
-    </w:p>
-    <w:p>
-      <w:pPr>
-        <w:spacing w:before="120" w:after="40" w:line="240" w:lineRule="auto"/>
-        <w:jc w:val="left"/>
-        <w:pBdr>
-          <w:bottom w:val="single" w:sz="8" w:space="1" w:color="0F2A44"/>
-        </w:pBdr>
-      </w:pPr>
-      <w:r>
-        <w:rPr>
-          <w:rFonts w:ascii="Calibri" w:hAnsi="Calibri" w:cs="Calibri" w:eastAsia="Calibri"/>
-          <w:b/>
-          <w:i w:val="0"/>
-          <w:color w:val="0F2A44"/>
-          <w:sz w:val="25"/>
-        </w:rPr>
-        <w:t>1. Tesisin Yeri</w:t>
-      </w:r>
-    </w:p>
-    <w:p>
-      <w:pPr>
-        <w:spacing w:before="0" w:after="80" w:line="240" w:lineRule="auto"/>
-        <w:jc w:val="both"/>
-      </w:pPr>
-      <w:r>
-        <w:rPr>
-          <w:rFonts w:ascii="Calibri" w:hAnsi="Calibri" w:cs="Calibri" w:eastAsia="Calibri"/>
-          <w:b w:val="0"/>
-          <w:i w:val="0"/>
-          <w:color w:val="1E293B"/>
-          <w:sz w:val="22"/>
-        </w:rPr>
-        <w:t>Mersin İli, Akdeniz İlçesi, Dikilitaş Mahallesi, 22226 Sokak, No: 4 A, İç Kapı No: 1 adresinde; tapunun 4 ada 4 parselinde kayıtlı net 7.500 m² alanda faaliyet göstermektedir. İşletme bu adreste mülk sahibi olarak bulunmaktadır. Mücavir alan sınırları içindedir.</w:t>
-      </w:r>
-    </w:p>
-    <w:p>
-      <w:pPr>
-        <w:spacing w:before="0" w:after="80" w:line="240" w:lineRule="auto"/>
-        <w:jc w:val="both"/>
-      </w:pPr>
-      <w:r>
-        <w:rPr>
-          <w:rFonts w:ascii="Calibri" w:hAnsi="Calibri" w:cs="Calibri" w:eastAsia="Calibri"/>
-          <w:b w:val="0"/>
-          <w:i w:val="0"/>
-          <w:color w:val="1E293B"/>
-          <w:sz w:val="22"/>
-        </w:rPr>
-        <w:t>Faaliyet konusu, motorlu kara taşıtı lastiklerinin ve jantlarının toptan ticaretidir (NACE 45.31.12). Çalışma şekli süreklidir. Tesiste 10 personel (1 usta, 9 işçi) bulunmaktadır.</w:t>
-      </w:r>
-    </w:p>
-    <w:p>
-      <w:pPr>
-        <w:spacing w:before="120" w:after="40" w:line="240" w:lineRule="auto"/>
-        <w:jc w:val="left"/>
-        <w:pBdr>
-          <w:bottom w:val="single" w:sz="8" w:space="1" w:color="0F2A44"/>
-        </w:pBdr>
-      </w:pPr>
-      <w:r>
-        <w:rPr>
-          <w:rFonts w:ascii="Calibri" w:hAnsi="Calibri" w:cs="Calibri" w:eastAsia="Calibri"/>
-          <w:b/>
-          <w:i w:val="0"/>
-          <w:color w:val="0F2A44"/>
-          <w:sz w:val="25"/>
-        </w:rPr>
-        <w:t>2. Proses Özeti</w:t>
-      </w:r>
-    </w:p>
-    <w:p>
-      <w:pPr>
-        <w:spacing w:before="0" w:after="80" w:line="240" w:lineRule="auto"/>
-        <w:jc w:val="both"/>
-      </w:pPr>
-      <w:r>
-        <w:rPr>
-          <w:rFonts w:ascii="Calibri" w:hAnsi="Calibri" w:cs="Calibri" w:eastAsia="Calibri"/>
-          <w:b w:val="0"/>
-          <w:i w:val="0"/>
-          <w:color w:val="1E293B"/>
-          <w:sz w:val="22"/>
-        </w:rPr>
-        <w:t>Faaliyet kapsamında motorlu kara taşıtlarına yönelik lastik ve jantlar, üretici firmalar veya yetkili tedarikçilerden temin edilmektedir. Tesise gelen ürünler mal kabul ve kalite kontrol işlemlerinden geçirilerek depolanmaktadır. Müşterilerden alınan siparişler doğrultusunda ürünler stoktan hazırlanmakta, paketlenmekte ve sevkiyata hazır hale getirilmektedir. Ürünler toptan satış kapsamında bayi, servis, filo işletmeleri ve diğer ticari müşterilere ulaştırılmaktadır.</w:t>
-      </w:r>
-    </w:p>
-    <w:p>
-      <w:pPr>
-        <w:spacing w:before="0" w:after="80" w:line="240" w:lineRule="auto"/>
-        <w:jc w:val="both"/>
-      </w:pPr>
-      <w:r>
-        <w:rPr>
-          <w:rFonts w:ascii="Calibri" w:hAnsi="Calibri" w:cs="Calibri" w:eastAsia="Calibri"/>
-          <w:b w:val="0"/>
-          <w:i w:val="0"/>
-          <w:color w:val="1E293B"/>
-          <w:sz w:val="22"/>
-        </w:rPr>
-        <w:t>Faaliyet sürecinde herhangi bir üretim işlemi bulunmamaktadır. Depolama, sipariş yönetimi, sevkiyat ve satış işlemleri gerçekleştirilmektedir.</w:t>
-      </w:r>
-    </w:p>
-    <w:p>
-      <w:pPr>
-        <w:spacing w:before="120" w:after="40" w:line="240" w:lineRule="auto"/>
-        <w:jc w:val="left"/>
-        <w:pBdr>
-          <w:bottom w:val="single" w:sz="8" w:space="1" w:color="0F2A44"/>
-        </w:pBdr>
-      </w:pPr>
-      <w:r>
-        <w:rPr>
-          <w:rFonts w:ascii="Calibri" w:hAnsi="Calibri" w:cs="Calibri" w:eastAsia="Calibri"/>
-          <w:b/>
-          <w:i w:val="0"/>
-          <w:color w:val="0F2A44"/>
-          <w:sz w:val="25"/>
-        </w:rPr>
-        <w:t>3. Tesiste Kaynaklanacak Sıvı Atıklar</w:t>
-      </w:r>
-    </w:p>
-    <w:p>
-      <w:pPr>
-        <w:spacing w:before="0" w:after="80" w:line="240" w:lineRule="auto"/>
-        <w:jc w:val="both"/>
-      </w:pPr>
-      <w:r>
-        <w:rPr>
-          <w:rFonts w:ascii="Calibri" w:hAnsi="Calibri" w:cs="Calibri" w:eastAsia="Calibri"/>
-          <w:b w:val="0"/>
-          <w:i w:val="0"/>
-          <w:color w:val="1E293B"/>
-          <w:sz w:val="22"/>
-        </w:rPr>
-        <w:t>İşletmede şebeke suyu kullanılmaktadır. Tesiste kuyu suyu kullanımı da vardır. Çalışanlardan kaynaklanan evsel atıksu için Atıksu Deşarj İzin Belgesi kapsamında MESKİ’ye başvuruda bulunulacaktır. Tesiste endüstriyel atıksu, yağmur ve yıkama suyu ile diğer atıksu oluşmamaktadır. Atıksu arıtma tesisi bulunmamaktadır.</w:t>
-      </w:r>
-    </w:p>
-    <w:p>
-      <w:pPr>
-        <w:spacing w:before="120" w:after="40" w:line="240" w:lineRule="auto"/>
-        <w:jc w:val="left"/>
-        <w:pBdr>
-          <w:bottom w:val="single" w:sz="8" w:space="1" w:color="0F2A44"/>
-        </w:pBdr>
-      </w:pPr>
-      <w:r>
-        <w:rPr>
-          <w:rFonts w:ascii="Calibri" w:hAnsi="Calibri" w:cs="Calibri" w:eastAsia="Calibri"/>
-          <w:b/>
-          <w:i w:val="0"/>
-          <w:color w:val="0F2A44"/>
-          <w:sz w:val="25"/>
-        </w:rPr>
-        <w:t>4. Tesiste Kaynaklanacak Emisyonlar</w:t>
-      </w:r>
-    </w:p>
-    <w:p>
-      <w:pPr>
-        <w:spacing w:before="0" w:after="80" w:line="240" w:lineRule="auto"/>
-        <w:jc w:val="both"/>
-      </w:pPr>
-      <w:r>
-        <w:rPr>
-          <w:rFonts w:ascii="Calibri" w:hAnsi="Calibri" w:cs="Calibri" w:eastAsia="Calibri"/>
-          <w:b w:val="0"/>
-          <w:i w:val="0"/>
-          <w:color w:val="1E293B"/>
-          <w:sz w:val="22"/>
-        </w:rPr>
-        <w:t>Tesiste emisyon kaynağı bulunmamaktadır. Kontrolsüz emisyon kaynağı gözlemlenmemiştir. Tesis SKHKKY Ek-3 kapsamında olmadığından sürekli emisyon ölçümü yapılmamaktadır. Tesis içi yollar tozumayan madde ile kaplıdır. Açıkta depolanan yığma malzeme bulunmamaktadır.</w:t>
-      </w:r>
-    </w:p>
-    <w:p>
-      <w:pPr>
-        <w:spacing w:before="120" w:after="40" w:line="240" w:lineRule="auto"/>
-        <w:jc w:val="left"/>
-        <w:pBdr>
-          <w:bottom w:val="single" w:sz="8" w:space="1" w:color="0F2A44"/>
-        </w:pBdr>
-      </w:pPr>
-      <w:r>
-        <w:rPr>
-          <w:rFonts w:ascii="Calibri" w:hAnsi="Calibri" w:cs="Calibri" w:eastAsia="Calibri"/>
-          <w:b/>
-          <w:i w:val="0"/>
-          <w:color w:val="0F2A44"/>
-          <w:sz w:val="25"/>
-        </w:rPr>
-        <w:t>5. Tesiste Kaynaklanacak Atıklar</w:t>
-      </w:r>
-    </w:p>
-    <w:p>
-      <w:pPr>
-        <w:spacing w:before="0" w:after="80" w:line="240" w:lineRule="auto"/>
-        <w:jc w:val="both"/>
-      </w:pPr>
-      <w:r>
-        <w:rPr>
-          <w:rFonts w:ascii="Calibri" w:hAnsi="Calibri" w:cs="Calibri" w:eastAsia="Calibri"/>
-          <w:b w:val="0"/>
-          <w:i w:val="0"/>
-          <w:color w:val="1E293B"/>
-          <w:sz w:val="22"/>
-        </w:rPr>
-        <w:t>Tesiste oluşması muhtemel atıklar aşağıdadır. Proses atığı oluşmamaktadır.</w:t>
+        <w:t>Tesiste oluşması muhtemel atıklar;</w:t>
       </w:r>
     </w:p>
     <w:tbl>
       <w:tblPr>
-        <w:tblW w:type="dxa" w:w="9979"/>
+        <w:tblW w:type="auto" w:w="0"/>
         <w:jc w:val="center"/>
         <w:tblLook w:firstColumn="1" w:firstRow="1" w:lastColumn="0" w:lastRow="0" w:noHBand="0" w:noVBand="1" w:val="04A0"/>
-        <w:tblInd w:w="0" w:type="dxa"/>
       </w:tblPr>
       <w:tblGrid>
-        <w:gridCol w:w="2041"/>
-        <w:gridCol w:w="7938"/>
+        <w:gridCol w:w="4933"/>
+        <w:gridCol w:w="4933"/>
       </w:tblGrid>
       <w:tr>
-        <w:trPr>
-          <w:trHeight w:val="240" w:hRule="atLeast"/>
-          <w:cantSplit/>
-        </w:trPr>
         <w:tc>
           <w:tcPr>
-            <w:tcW w:type="dxa" w:w="2041"/>
-            <w:shd w:fill="0F2A44" w:val="clear"/>
+            <w:tcW w:type="dxa" w:w="4933"/>
             <w:tcBorders>
-              <w:top w:val="single" w:sz="6" w:space="0" w:color="CBD5E1"/>
-              <w:left w:val="single" w:sz="6" w:space="0" w:color="CBD5E1"/>
-              <w:bottom w:val="single" w:sz="6" w:space="0" w:color="CBD5E1"/>
-              <w:right w:val="single" w:sz="6" w:space="0" w:color="CBD5E1"/>
+              <w:top w:val="single" w:sz="8" w:space="0" w:color="000000"/>
+              <w:left w:val="single" w:sz="8" w:space="0" w:color="000000"/>
+              <w:bottom w:val="single" w:sz="8" w:space="0" w:color="000000"/>
+              <w:right w:val="single" w:sz="8" w:space="0" w:color="000000"/>
             </w:tcBorders>
             <w:vAlign w:val="center"/>
-            <w:tcMar>
-              <w:top w:w="60" w:type="dxa"/>
-              <w:left w:w="100" w:type="dxa"/>
-              <w:bottom w:w="60" w:type="dxa"/>
-              <w:right w:w="100" w:type="dxa"/>
-            </w:tcMar>
           </w:tcPr>
           <w:p>
             <w:pPr>
-              <w:spacing w:before="0" w:after="0"/>
-              <w:jc w:val="left"/>
+              <w:spacing w:before="20" w:after="20"/>
+              <w:jc w:val="center"/>
             </w:pPr>
             <w:r>
               <w:rPr>
-                <w:rFonts w:ascii="Calibri" w:hAnsi="Calibri" w:cs="Calibri" w:eastAsia="Calibri"/>
+                <w:rFonts w:ascii="Times New Roman" w:hAnsi="Times New Roman" w:cs="Times New Roman" w:eastAsia="Times New Roman"/>
                 <w:b/>
-                <w:i w:val="0"/>
-                <w:color w:val="FFFFFF"/>
-                <w:sz w:val="20"/>
+                <w:color w:val="000000"/>
+                <w:sz w:val="22"/>
               </w:rPr>
-              <w:t>Atık kodu</w:t>
+              <w:t>ATIK KODU</w:t>
             </w:r>
           </w:p>
         </w:tc>
         <w:tc>
           <w:tcPr>
-            <w:tcW w:type="dxa" w:w="7938"/>
-            <w:shd w:fill="0F2A44" w:val="clear"/>
+            <w:tcW w:type="dxa" w:w="4933"/>
             <w:tcBorders>
-              <w:top w:val="single" w:sz="6" w:space="0" w:color="CBD5E1"/>
-              <w:left w:val="single" w:sz="6" w:space="0" w:color="CBD5E1"/>
-              <w:bottom w:val="single" w:sz="6" w:space="0" w:color="CBD5E1"/>
-              <w:right w:val="single" w:sz="6" w:space="0" w:color="CBD5E1"/>
+              <w:top w:val="single" w:sz="8" w:space="0" w:color="000000"/>
+              <w:left w:val="single" w:sz="8" w:space="0" w:color="000000"/>
+              <w:bottom w:val="single" w:sz="8" w:space="0" w:color="000000"/>
+              <w:right w:val="single" w:sz="8" w:space="0" w:color="000000"/>
             </w:tcBorders>
             <w:vAlign w:val="center"/>
-            <w:tcMar>
-              <w:top w:w="60" w:type="dxa"/>
-              <w:left w:w="100" w:type="dxa"/>
-              <w:bottom w:w="60" w:type="dxa"/>
-              <w:right w:w="100" w:type="dxa"/>
-            </w:tcMar>
           </w:tcPr>
           <w:p>
             <w:pPr>
-              <w:spacing w:before="0" w:after="0"/>
-              <w:jc w:val="left"/>
+              <w:spacing w:before="20" w:after="20"/>
+              <w:jc w:val="center"/>
             </w:pPr>
             <w:r>
               <w:rPr>
-                <w:rFonts w:ascii="Calibri" w:hAnsi="Calibri" w:cs="Calibri" w:eastAsia="Calibri"/>
+                <w:rFonts w:ascii="Times New Roman" w:hAnsi="Times New Roman" w:cs="Times New Roman" w:eastAsia="Times New Roman"/>
                 <w:b/>
-                <w:i w:val="0"/>
-                <w:color w:val="FFFFFF"/>
-                <w:sz w:val="20"/>
+                <w:color w:val="000000"/>
+                <w:sz w:val="22"/>
               </w:rPr>
-              <w:t>Atık kodu tanımı</w:t>
+              <w:t>ATIK KODU TANIMI</w:t>
             </w:r>
           </w:p>
         </w:tc>
       </w:tr>
       <w:tr>
-        <w:trPr>
-          <w:trHeight w:val="240" w:hRule="atLeast"/>
-          <w:cantSplit/>
-        </w:trPr>
         <w:tc>
           <w:tcPr>
-            <w:tcW w:type="dxa" w:w="2041"/>
-            <w:shd w:fill="FFFFFF" w:val="clear"/>
+            <w:tcW w:type="dxa" w:w="4933"/>
             <w:tcBorders>
-              <w:top w:val="single" w:sz="6" w:space="0" w:color="CBD5E1"/>
-              <w:left w:val="single" w:sz="6" w:space="0" w:color="CBD5E1"/>
-              <w:bottom w:val="single" w:sz="6" w:space="0" w:color="CBD5E1"/>
-              <w:right w:val="single" w:sz="6" w:space="0" w:color="CBD5E1"/>
+              <w:top w:val="single" w:sz="8" w:space="0" w:color="000000"/>
+              <w:left w:val="single" w:sz="8" w:space="0" w:color="000000"/>
+              <w:bottom w:val="single" w:sz="8" w:space="0" w:color="000000"/>
+              <w:right w:val="single" w:sz="8" w:space="0" w:color="000000"/>
             </w:tcBorders>
             <w:vAlign w:val="center"/>
-            <w:tcMar>
-              <w:top w:w="60" w:type="dxa"/>
-              <w:left w:w="100" w:type="dxa"/>
-              <w:bottom w:w="60" w:type="dxa"/>
-              <w:right w:w="100" w:type="dxa"/>
-            </w:tcMar>
           </w:tcPr>
           <w:p>
             <w:pPr>
-              <w:spacing w:before="0" w:after="0"/>
-              <w:jc w:val="left"/>
+              <w:spacing w:before="20" w:after="20"/>
+              <w:jc w:val="center"/>
             </w:pPr>
             <w:r>
               <w:rPr>
-                <w:rFonts w:ascii="Calibri" w:hAnsi="Calibri" w:cs="Calibri" w:eastAsia="Calibri"/>
+                <w:rFonts w:ascii="Times New Roman" w:hAnsi="Times New Roman" w:cs="Times New Roman" w:eastAsia="Times New Roman"/>
                 <w:b/>
-                <w:i w:val="0"/>
-                <w:color w:val="1E293B"/>
-                <w:sz w:val="20"/>
+                <w:color w:val="000000"/>
+                <w:sz w:val="22"/>
               </w:rPr>
               <w:t>15 01 06</w:t>
             </w:r>
@@ -386,34 +392,26 @@
         </w:tc>
         <w:tc>
           <w:tcPr>
-            <w:tcW w:type="dxa" w:w="7938"/>
-            <w:shd w:fill="FFFFFF" w:val="clear"/>
+            <w:tcW w:type="dxa" w:w="4933"/>
             <w:tcBorders>
-              <w:top w:val="single" w:sz="6" w:space="0" w:color="CBD5E1"/>
-              <w:left w:val="single" w:sz="6" w:space="0" w:color="CBD5E1"/>
-              <w:bottom w:val="single" w:sz="6" w:space="0" w:color="CBD5E1"/>
-              <w:right w:val="single" w:sz="6" w:space="0" w:color="CBD5E1"/>
+              <w:top w:val="single" w:sz="8" w:space="0" w:color="000000"/>
+              <w:left w:val="single" w:sz="8" w:space="0" w:color="000000"/>
+              <w:bottom w:val="single" w:sz="8" w:space="0" w:color="000000"/>
+              <w:right w:val="single" w:sz="8" w:space="0" w:color="000000"/>
             </w:tcBorders>
             <w:vAlign w:val="center"/>
-            <w:tcMar>
-              <w:top w:w="60" w:type="dxa"/>
-              <w:left w:w="100" w:type="dxa"/>
-              <w:bottom w:w="60" w:type="dxa"/>
-              <w:right w:w="100" w:type="dxa"/>
-            </w:tcMar>
           </w:tcPr>
           <w:p>
             <w:pPr>
-              <w:spacing w:before="0" w:after="0"/>
+              <w:spacing w:before="20" w:after="20"/>
               <w:jc w:val="left"/>
             </w:pPr>
             <w:r>
               <w:rPr>
-                <w:rFonts w:ascii="Calibri" w:hAnsi="Calibri" w:cs="Calibri" w:eastAsia="Calibri"/>
+                <w:rFonts w:ascii="Times New Roman" w:hAnsi="Times New Roman" w:cs="Times New Roman" w:eastAsia="Times New Roman"/>
                 <w:b w:val="0"/>
-                <w:i w:val="0"/>
-                <w:color w:val="1E293B"/>
-                <w:sz w:val="20"/>
+                <w:color w:val="000000"/>
+                <w:sz w:val="22"/>
               </w:rPr>
               <w:t>Karışık ambalaj</w:t>
             </w:r>
@@ -421,40 +419,28 @@
         </w:tc>
       </w:tr>
       <w:tr>
-        <w:trPr>
-          <w:trHeight w:val="240" w:hRule="atLeast"/>
-          <w:cantSplit/>
-        </w:trPr>
         <w:tc>
           <w:tcPr>
-            <w:tcW w:type="dxa" w:w="2041"/>
-            <w:shd w:fill="FFFFFF" w:val="clear"/>
+            <w:tcW w:type="dxa" w:w="4933"/>
             <w:tcBorders>
-              <w:top w:val="single" w:sz="6" w:space="0" w:color="CBD5E1"/>
-              <w:left w:val="single" w:sz="6" w:space="0" w:color="CBD5E1"/>
-              <w:bottom w:val="single" w:sz="6" w:space="0" w:color="CBD5E1"/>
-              <w:right w:val="single" w:sz="6" w:space="0" w:color="CBD5E1"/>
+              <w:top w:val="single" w:sz="8" w:space="0" w:color="000000"/>
+              <w:left w:val="single" w:sz="8" w:space="0" w:color="000000"/>
+              <w:bottom w:val="single" w:sz="8" w:space="0" w:color="000000"/>
+              <w:right w:val="single" w:sz="8" w:space="0" w:color="000000"/>
             </w:tcBorders>
             <w:vAlign w:val="center"/>
-            <w:tcMar>
-              <w:top w:w="60" w:type="dxa"/>
-              <w:left w:w="100" w:type="dxa"/>
-              <w:bottom w:w="60" w:type="dxa"/>
-              <w:right w:w="100" w:type="dxa"/>
-            </w:tcMar>
           </w:tcPr>
           <w:p>
             <w:pPr>
-              <w:spacing w:before="0" w:after="0"/>
-              <w:jc w:val="left"/>
+              <w:spacing w:before="20" w:after="20"/>
+              <w:jc w:val="center"/>
             </w:pPr>
             <w:r>
               <w:rPr>
-                <w:rFonts w:ascii="Calibri" w:hAnsi="Calibri" w:cs="Calibri" w:eastAsia="Calibri"/>
+                <w:rFonts w:ascii="Times New Roman" w:hAnsi="Times New Roman" w:cs="Times New Roman" w:eastAsia="Times New Roman"/>
                 <w:b/>
-                <w:i w:val="0"/>
-                <w:color w:val="1E293B"/>
-                <w:sz w:val="20"/>
+                <w:color w:val="000000"/>
+                <w:sz w:val="22"/>
               </w:rPr>
               <w:t>15 01 10*</w:t>
             </w:r>
@@ -462,34 +448,26 @@
         </w:tc>
         <w:tc>
           <w:tcPr>
-            <w:tcW w:type="dxa" w:w="7938"/>
-            <w:shd w:fill="FFFFFF" w:val="clear"/>
+            <w:tcW w:type="dxa" w:w="4933"/>
             <w:tcBorders>
-              <w:top w:val="single" w:sz="6" w:space="0" w:color="CBD5E1"/>
-              <w:left w:val="single" w:sz="6" w:space="0" w:color="CBD5E1"/>
-              <w:bottom w:val="single" w:sz="6" w:space="0" w:color="CBD5E1"/>
-              <w:right w:val="single" w:sz="6" w:space="0" w:color="CBD5E1"/>
+              <w:top w:val="single" w:sz="8" w:space="0" w:color="000000"/>
+              <w:left w:val="single" w:sz="8" w:space="0" w:color="000000"/>
+              <w:bottom w:val="single" w:sz="8" w:space="0" w:color="000000"/>
+              <w:right w:val="single" w:sz="8" w:space="0" w:color="000000"/>
             </w:tcBorders>
             <w:vAlign w:val="center"/>
-            <w:tcMar>
-              <w:top w:w="60" w:type="dxa"/>
-              <w:left w:w="100" w:type="dxa"/>
-              <w:bottom w:w="60" w:type="dxa"/>
-              <w:right w:w="100" w:type="dxa"/>
-            </w:tcMar>
           </w:tcPr>
           <w:p>
             <w:pPr>
-              <w:spacing w:before="0" w:after="0"/>
+              <w:spacing w:before="20" w:after="20"/>
               <w:jc w:val="left"/>
             </w:pPr>
             <w:r>
               <w:rPr>
-                <w:rFonts w:ascii="Calibri" w:hAnsi="Calibri" w:cs="Calibri" w:eastAsia="Calibri"/>
+                <w:rFonts w:ascii="Times New Roman" w:hAnsi="Times New Roman" w:cs="Times New Roman" w:eastAsia="Times New Roman"/>
                 <w:b w:val="0"/>
-                <w:i w:val="0"/>
-                <w:color w:val="1E293B"/>
-                <w:sz w:val="20"/>
+                <w:color w:val="000000"/>
+                <w:sz w:val="22"/>
               </w:rPr>
               <w:t>Tehlikeli maddelerin kalıntılarını içeren ya da tehlikeli maddelerle kontamine olmuş ambalajlar</w:t>
             </w:r>
@@ -497,40 +475,28 @@
         </w:tc>
       </w:tr>
       <w:tr>
-        <w:trPr>
-          <w:trHeight w:val="240" w:hRule="atLeast"/>
-          <w:cantSplit/>
-        </w:trPr>
         <w:tc>
           <w:tcPr>
-            <w:tcW w:type="dxa" w:w="2041"/>
-            <w:shd w:fill="FFFFFF" w:val="clear"/>
+            <w:tcW w:type="dxa" w:w="4933"/>
             <w:tcBorders>
-              <w:top w:val="single" w:sz="6" w:space="0" w:color="CBD5E1"/>
-              <w:left w:val="single" w:sz="6" w:space="0" w:color="CBD5E1"/>
-              <w:bottom w:val="single" w:sz="6" w:space="0" w:color="CBD5E1"/>
-              <w:right w:val="single" w:sz="6" w:space="0" w:color="CBD5E1"/>
+              <w:top w:val="single" w:sz="8" w:space="0" w:color="000000"/>
+              <w:left w:val="single" w:sz="8" w:space="0" w:color="000000"/>
+              <w:bottom w:val="single" w:sz="8" w:space="0" w:color="000000"/>
+              <w:right w:val="single" w:sz="8" w:space="0" w:color="000000"/>
             </w:tcBorders>
             <w:vAlign w:val="center"/>
-            <w:tcMar>
-              <w:top w:w="60" w:type="dxa"/>
-              <w:left w:w="100" w:type="dxa"/>
-              <w:bottom w:w="60" w:type="dxa"/>
-              <w:right w:w="100" w:type="dxa"/>
-            </w:tcMar>
           </w:tcPr>
           <w:p>
             <w:pPr>
-              <w:spacing w:before="0" w:after="0"/>
-              <w:jc w:val="left"/>
+              <w:spacing w:before="20" w:after="20"/>
+              <w:jc w:val="center"/>
             </w:pPr>
             <w:r>
               <w:rPr>
-                <w:rFonts w:ascii="Calibri" w:hAnsi="Calibri" w:cs="Calibri" w:eastAsia="Calibri"/>
+                <w:rFonts w:ascii="Times New Roman" w:hAnsi="Times New Roman" w:cs="Times New Roman" w:eastAsia="Times New Roman"/>
                 <w:b/>
-                <w:i w:val="0"/>
-                <w:color w:val="1E293B"/>
-                <w:sz w:val="20"/>
+                <w:color w:val="000000"/>
+                <w:sz w:val="22"/>
               </w:rPr>
               <w:t>15 02 02*</w:t>
             </w:r>
@@ -538,34 +504,26 @@
         </w:tc>
         <w:tc>
           <w:tcPr>
-            <w:tcW w:type="dxa" w:w="7938"/>
-            <w:shd w:fill="FFFFFF" w:val="clear"/>
+            <w:tcW w:type="dxa" w:w="4933"/>
             <w:tcBorders>
-              <w:top w:val="single" w:sz="6" w:space="0" w:color="CBD5E1"/>
-              <w:left w:val="single" w:sz="6" w:space="0" w:color="CBD5E1"/>
-              <w:bottom w:val="single" w:sz="6" w:space="0" w:color="CBD5E1"/>
-              <w:right w:val="single" w:sz="6" w:space="0" w:color="CBD5E1"/>
+              <w:top w:val="single" w:sz="8" w:space="0" w:color="000000"/>
+              <w:left w:val="single" w:sz="8" w:space="0" w:color="000000"/>
+              <w:bottom w:val="single" w:sz="8" w:space="0" w:color="000000"/>
+              <w:right w:val="single" w:sz="8" w:space="0" w:color="000000"/>
             </w:tcBorders>
             <w:vAlign w:val="center"/>
-            <w:tcMar>
-              <w:top w:w="60" w:type="dxa"/>
-              <w:left w:w="100" w:type="dxa"/>
-              <w:bottom w:w="60" w:type="dxa"/>
-              <w:right w:w="100" w:type="dxa"/>
-            </w:tcMar>
           </w:tcPr>
           <w:p>
             <w:pPr>
-              <w:spacing w:before="0" w:after="0"/>
+              <w:spacing w:before="20" w:after="20"/>
               <w:jc w:val="left"/>
             </w:pPr>
             <w:r>
               <w:rPr>
-                <w:rFonts w:ascii="Calibri" w:hAnsi="Calibri" w:cs="Calibri" w:eastAsia="Calibri"/>
+                <w:rFonts w:ascii="Times New Roman" w:hAnsi="Times New Roman" w:cs="Times New Roman" w:eastAsia="Times New Roman"/>
                 <w:b w:val="0"/>
-                <w:i w:val="0"/>
-                <w:color w:val="1E293B"/>
-                <w:sz w:val="20"/>
+                <w:color w:val="000000"/>
+                <w:sz w:val="22"/>
               </w:rPr>
               <w:t>Tehlikeli maddelerle kirlenmiş emiciler, filtre malzemeleri (başka şekilde tanımlanmamış ise yağ filtreleri), temizleme bezleri, koruyucu giysiler</w:t>
             </w:r>
@@ -573,40 +531,28 @@
         </w:tc>
       </w:tr>
       <w:tr>
-        <w:trPr>
-          <w:trHeight w:val="240" w:hRule="atLeast"/>
-          <w:cantSplit/>
-        </w:trPr>
         <w:tc>
           <w:tcPr>
-            <w:tcW w:type="dxa" w:w="2041"/>
-            <w:shd w:fill="FFFFFF" w:val="clear"/>
+            <w:tcW w:type="dxa" w:w="4933"/>
             <w:tcBorders>
-              <w:top w:val="single" w:sz="6" w:space="0" w:color="CBD5E1"/>
-              <w:left w:val="single" w:sz="6" w:space="0" w:color="CBD5E1"/>
-              <w:bottom w:val="single" w:sz="6" w:space="0" w:color="CBD5E1"/>
-              <w:right w:val="single" w:sz="6" w:space="0" w:color="CBD5E1"/>
+              <w:top w:val="single" w:sz="8" w:space="0" w:color="000000"/>
+              <w:left w:val="single" w:sz="8" w:space="0" w:color="000000"/>
+              <w:bottom w:val="single" w:sz="8" w:space="0" w:color="000000"/>
+              <w:right w:val="single" w:sz="8" w:space="0" w:color="000000"/>
             </w:tcBorders>
             <w:vAlign w:val="center"/>
-            <w:tcMar>
-              <w:top w:w="60" w:type="dxa"/>
-              <w:left w:w="100" w:type="dxa"/>
-              <w:bottom w:w="60" w:type="dxa"/>
-              <w:right w:w="100" w:type="dxa"/>
-            </w:tcMar>
           </w:tcPr>
           <w:p>
             <w:pPr>
-              <w:spacing w:before="0" w:after="0"/>
-              <w:jc w:val="left"/>
+              <w:spacing w:before="20" w:after="20"/>
+              <w:jc w:val="center"/>
             </w:pPr>
             <w:r>
               <w:rPr>
-                <w:rFonts w:ascii="Calibri" w:hAnsi="Calibri" w:cs="Calibri" w:eastAsia="Calibri"/>
+                <w:rFonts w:ascii="Times New Roman" w:hAnsi="Times New Roman" w:cs="Times New Roman" w:eastAsia="Times New Roman"/>
                 <w:b/>
-                <w:i w:val="0"/>
-                <w:color w:val="1E293B"/>
-                <w:sz w:val="20"/>
+                <w:color w:val="000000"/>
+                <w:sz w:val="22"/>
               </w:rPr>
               <w:t>20 01 08</w:t>
             </w:r>
@@ -614,34 +560,26 @@
         </w:tc>
         <w:tc>
           <w:tcPr>
-            <w:tcW w:type="dxa" w:w="7938"/>
-            <w:shd w:fill="FFFFFF" w:val="clear"/>
+            <w:tcW w:type="dxa" w:w="4933"/>
             <w:tcBorders>
-              <w:top w:val="single" w:sz="6" w:space="0" w:color="CBD5E1"/>
-              <w:left w:val="single" w:sz="6" w:space="0" w:color="CBD5E1"/>
-              <w:bottom w:val="single" w:sz="6" w:space="0" w:color="CBD5E1"/>
-              <w:right w:val="single" w:sz="6" w:space="0" w:color="CBD5E1"/>
+              <w:top w:val="single" w:sz="8" w:space="0" w:color="000000"/>
+              <w:left w:val="single" w:sz="8" w:space="0" w:color="000000"/>
+              <w:bottom w:val="single" w:sz="8" w:space="0" w:color="000000"/>
+              <w:right w:val="single" w:sz="8" w:space="0" w:color="000000"/>
             </w:tcBorders>
             <w:vAlign w:val="center"/>
-            <w:tcMar>
-              <w:top w:w="60" w:type="dxa"/>
-              <w:left w:w="100" w:type="dxa"/>
-              <w:bottom w:w="60" w:type="dxa"/>
-              <w:right w:w="100" w:type="dxa"/>
-            </w:tcMar>
           </w:tcPr>
           <w:p>
             <w:pPr>
-              <w:spacing w:before="0" w:after="0"/>
+              <w:spacing w:before="20" w:after="20"/>
               <w:jc w:val="left"/>
             </w:pPr>
             <w:r>
               <w:rPr>
-                <w:rFonts w:ascii="Calibri" w:hAnsi="Calibri" w:cs="Calibri" w:eastAsia="Calibri"/>
+                <w:rFonts w:ascii="Times New Roman" w:hAnsi="Times New Roman" w:cs="Times New Roman" w:eastAsia="Times New Roman"/>
                 <w:b w:val="0"/>
-                <w:i w:val="0"/>
-                <w:color w:val="1E293B"/>
-                <w:sz w:val="20"/>
+                <w:color w:val="000000"/>
+                <w:sz w:val="22"/>
               </w:rPr>
               <w:t>Biyolojik olarak bozunabilir mutfak ve kantin atıkları</w:t>
             </w:r>
@@ -649,40 +587,28 @@
         </w:tc>
       </w:tr>
       <w:tr>
-        <w:trPr>
-          <w:trHeight w:val="240" w:hRule="atLeast"/>
-          <w:cantSplit/>
-        </w:trPr>
         <w:tc>
           <w:tcPr>
-            <w:tcW w:type="dxa" w:w="2041"/>
-            <w:shd w:fill="FFFFFF" w:val="clear"/>
+            <w:tcW w:type="dxa" w:w="4933"/>
             <w:tcBorders>
-              <w:top w:val="single" w:sz="6" w:space="0" w:color="CBD5E1"/>
-              <w:left w:val="single" w:sz="6" w:space="0" w:color="CBD5E1"/>
-              <w:bottom w:val="single" w:sz="6" w:space="0" w:color="CBD5E1"/>
-              <w:right w:val="single" w:sz="6" w:space="0" w:color="CBD5E1"/>
+              <w:top w:val="single" w:sz="8" w:space="0" w:color="000000"/>
+              <w:left w:val="single" w:sz="8" w:space="0" w:color="000000"/>
+              <w:bottom w:val="single" w:sz="8" w:space="0" w:color="000000"/>
+              <w:right w:val="single" w:sz="8" w:space="0" w:color="000000"/>
             </w:tcBorders>
             <w:vAlign w:val="center"/>
-            <w:tcMar>
-              <w:top w:w="60" w:type="dxa"/>
-              <w:left w:w="100" w:type="dxa"/>
-              <w:bottom w:w="60" w:type="dxa"/>
-              <w:right w:w="100" w:type="dxa"/>
-            </w:tcMar>
           </w:tcPr>
           <w:p>
             <w:pPr>
-              <w:spacing w:before="0" w:after="0"/>
-              <w:jc w:val="left"/>
+              <w:spacing w:before="20" w:after="20"/>
+              <w:jc w:val="center"/>
             </w:pPr>
             <w:r>
               <w:rPr>
-                <w:rFonts w:ascii="Calibri" w:hAnsi="Calibri" w:cs="Calibri" w:eastAsia="Calibri"/>
+                <w:rFonts w:ascii="Times New Roman" w:hAnsi="Times New Roman" w:cs="Times New Roman" w:eastAsia="Times New Roman"/>
                 <w:b/>
-                <w:i w:val="0"/>
-                <w:color w:val="1E293B"/>
-                <w:sz w:val="20"/>
+                <w:color w:val="000000"/>
+                <w:sz w:val="22"/>
               </w:rPr>
               <w:t>20 01 26*</w:t>
             </w:r>
@@ -690,34 +616,26 @@
         </w:tc>
         <w:tc>
           <w:tcPr>
-            <w:tcW w:type="dxa" w:w="7938"/>
-            <w:shd w:fill="FFFFFF" w:val="clear"/>
+            <w:tcW w:type="dxa" w:w="4933"/>
             <w:tcBorders>
-              <w:top w:val="single" w:sz="6" w:space="0" w:color="CBD5E1"/>
-              <w:left w:val="single" w:sz="6" w:space="0" w:color="CBD5E1"/>
-              <w:bottom w:val="single" w:sz="6" w:space="0" w:color="CBD5E1"/>
-              <w:right w:val="single" w:sz="6" w:space="0" w:color="CBD5E1"/>
+              <w:top w:val="single" w:sz="8" w:space="0" w:color="000000"/>
+              <w:left w:val="single" w:sz="8" w:space="0" w:color="000000"/>
+              <w:bottom w:val="single" w:sz="8" w:space="0" w:color="000000"/>
+              <w:right w:val="single" w:sz="8" w:space="0" w:color="000000"/>
             </w:tcBorders>
             <w:vAlign w:val="center"/>
-            <w:tcMar>
-              <w:top w:w="60" w:type="dxa"/>
-              <w:left w:w="100" w:type="dxa"/>
-              <w:bottom w:w="60" w:type="dxa"/>
-              <w:right w:w="100" w:type="dxa"/>
-            </w:tcMar>
           </w:tcPr>
           <w:p>
             <w:pPr>
-              <w:spacing w:before="0" w:after="0"/>
+              <w:spacing w:before="20" w:after="20"/>
               <w:jc w:val="left"/>
             </w:pPr>
             <w:r>
               <w:rPr>
-                <w:rFonts w:ascii="Calibri" w:hAnsi="Calibri" w:cs="Calibri" w:eastAsia="Calibri"/>
+                <w:rFonts w:ascii="Times New Roman" w:hAnsi="Times New Roman" w:cs="Times New Roman" w:eastAsia="Times New Roman"/>
                 <w:b w:val="0"/>
-                <w:i w:val="0"/>
-                <w:color w:val="1E293B"/>
-                <w:sz w:val="20"/>
+                <w:color w:val="000000"/>
+                <w:sz w:val="22"/>
               </w:rPr>
               <w:t>20 01 25 dışındaki sıvı ve katı yağlar</w:t>
             </w:r>
@@ -727,51 +645,45 @@
     </w:tbl>
     <w:p>
       <w:pPr>
-        <w:spacing w:before="120" w:after="80" w:line="240" w:lineRule="auto"/>
+        <w:spacing w:before="80" w:after="60" w:line="240" w:lineRule="auto"/>
         <w:jc w:val="both"/>
       </w:pPr>
       <w:r>
         <w:rPr>
-          <w:rFonts w:ascii="Calibri" w:hAnsi="Calibri" w:cs="Calibri" w:eastAsia="Calibri"/>
+          <w:rFonts w:ascii="Times New Roman" w:hAnsi="Times New Roman" w:cs="Times New Roman" w:eastAsia="Times New Roman"/>
           <w:b w:val="0"/>
-          <w:i w:val="0"/>
-          <w:color w:val="1E293B"/>
-          <w:sz w:val="22"/>
+          <w:color w:val="000000"/>
+          <w:sz w:val="24"/>
         </w:rPr>
-        <w:t>Tehlikesiz atıklar, Çevre ve Şehircilik Bakanlığı’ndan yetki almış geri dönüşüm firmalarına verilecektir. Tehlikeli atıklar, Bakanlıktan yetki almış bertaraf/geri kazanım tesislerine gönderilecektir. Evsel atıkların bertarafı Akdeniz Belediyesi tarafından sağlanacaktır.</w:t>
+        <w:t>Tehlikesiz atıklar, Çevre ve Şehircilik Bakanlığı’ndan yetki almış geri dönüşüm firmalarına verilecektir. Oluşabilecek tehlikeli atıklar ise, Çevre ve Şehircilik Bakanlığı’ndan yetki almış bertaraf/geri kazanım tesislerine gönderilecek ve bertarafı sağlanacaktır. Tesiste oluşacak evsel atıkların bertarafı, Akdeniz Belediyesi tarafından sağlanacaktır.</w:t>
       </w:r>
     </w:p>
     <w:p>
       <w:pPr>
         <w:spacing w:before="120" w:after="40" w:line="240" w:lineRule="auto"/>
-        <w:jc w:val="left"/>
-        <w:pBdr>
-          <w:bottom w:val="single" w:sz="8" w:space="1" w:color="0F2A44"/>
-        </w:pBdr>
+        <w:jc w:val="center"/>
       </w:pPr>
       <w:r>
         <w:rPr>
-          <w:rFonts w:ascii="Calibri" w:hAnsi="Calibri" w:cs="Calibri" w:eastAsia="Calibri"/>
+          <w:rFonts w:ascii="Times New Roman" w:hAnsi="Times New Roman" w:cs="Times New Roman" w:eastAsia="Times New Roman"/>
           <w:b/>
-          <w:i w:val="0"/>
-          <w:color w:val="0F2A44"/>
-          <w:sz w:val="25"/>
+          <w:color w:val="000000"/>
+          <w:sz w:val="24"/>
         </w:rPr>
-        <w:t>6. Tesiste Kaynaklanacak Gürültü</w:t>
+        <w:t>6. TESİSTE KAYNAKLANACAK GÜRÜLTÜ</w:t>
       </w:r>
     </w:p>
     <w:p>
       <w:pPr>
-        <w:spacing w:before="0" w:after="40" w:line="240" w:lineRule="auto"/>
+        <w:spacing w:before="0" w:after="60" w:line="240" w:lineRule="auto"/>
         <w:jc w:val="both"/>
       </w:pPr>
       <w:r>
         <w:rPr>
-          <w:rFonts w:ascii="Calibri" w:hAnsi="Calibri" w:cs="Calibri" w:eastAsia="Calibri"/>
+          <w:rFonts w:ascii="Times New Roman" w:hAnsi="Times New Roman" w:cs="Times New Roman" w:eastAsia="Times New Roman"/>
           <w:b w:val="0"/>
-          <w:i w:val="0"/>
-          <w:color w:val="1E293B"/>
-          <w:sz w:val="22"/>
+          <w:color w:val="000000"/>
+          <w:sz w:val="24"/>
         </w:rPr>
         <w:t>İç tetkik raporunda gürültü kaynağına ilişkin ayrı bir tespit yer almamaktadır.</w:t>
       </w:r>
@@ -779,699 +691,48 @@
     <w:p>
       <w:pPr>
         <w:pageBreakBefore/>
-        <w:spacing w:after="0"/>
+        <w:spacing w:before="0" w:after="0"/>
         <w:jc w:val="center"/>
       </w:pPr>
       <w:r>
-        <w:rPr>
-          <w:rFonts w:ascii="Calibri" w:hAnsi="Calibri" w:cs="Calibri" w:eastAsia="Calibri"/>
-          <w:b/>
-          <w:i w:val="0"/>
-          <w:color w:val="0F2A44"/>
-          <w:sz w:val="24"/>
-        </w:rPr>
-        <w:t>MERLAS Oto Lastik Endüstri Sanayi ve Ticaret Limited Şirketi</w:t>
-      </w:r>
-    </w:p>
-    <w:p>
-      <w:pPr>
-        <w:spacing w:before="0" w:after="40" w:line="240" w:lineRule="auto"/>
-        <w:jc w:val="center"/>
-      </w:pPr>
-      <w:r>
-        <w:rPr>
-          <w:rFonts w:ascii="Calibri" w:hAnsi="Calibri" w:cs="Calibri" w:eastAsia="Calibri"/>
-          <w:b w:val="0"/>
-          <w:i w:val="0"/>
-          <w:color w:val="475569"/>
-          <w:sz w:val="22"/>
-        </w:rPr>
-        <w:t>Lastik ve Jant Toptan Ticareti</w:t>
-      </w:r>
-    </w:p>
-    <w:p>
-      <w:pPr>
-        <w:spacing w:before="0" w:after="160" w:line="240" w:lineRule="auto"/>
-        <w:jc w:val="center"/>
-      </w:pPr>
-      <w:r>
-        <w:rPr>
-          <w:rFonts w:ascii="Calibri" w:hAnsi="Calibri" w:cs="Calibri" w:eastAsia="Calibri"/>
-          <w:b/>
-          <w:i w:val="0"/>
-          <w:color w:val="0F2A44"/>
-          <w:sz w:val="32"/>
-        </w:rPr>
-        <w:t>İş Akım Şeması</w:t>
-      </w:r>
-    </w:p>
-    <w:tbl>
-      <w:tblPr>
-        <w:tblW w:type="dxa" w:w="8051"/>
-        <w:jc w:val="center"/>
-        <w:tblLook w:firstColumn="1" w:firstRow="1" w:lastColumn="0" w:lastRow="0" w:noHBand="0" w:noVBand="1" w:val="04A0"/>
-        <w:tblInd w:w="0" w:type="dxa"/>
-      </w:tblPr>
-      <w:tblGrid>
-        <w:gridCol w:w="8051"/>
-      </w:tblGrid>
-      <w:tr>
-        <w:trPr>
-          <w:trHeight w:val="420" w:hRule="atLeast"/>
-          <w:cantSplit/>
-        </w:trPr>
-        <w:tc>
-          <w:tcPr>
-            <w:tcW w:type="dxa" w:w="8051"/>
-            <w:shd w:fill="E8F1FA" w:val="clear"/>
-            <w:tcBorders>
-              <w:top w:val="single" w:sz="12" w:space="0" w:color="1F4E79"/>
-              <w:left w:val="single" w:sz="12" w:space="0" w:color="1F4E79"/>
-              <w:bottom w:val="single" w:sz="12" w:space="0" w:color="1F4E79"/>
-              <w:right w:val="single" w:sz="12" w:space="0" w:color="1F4E79"/>
-            </w:tcBorders>
-            <w:vAlign w:val="center"/>
-            <w:tcMar>
-              <w:top w:w="60" w:type="dxa"/>
-              <w:left w:w="100" w:type="dxa"/>
-              <w:bottom w:w="60" w:type="dxa"/>
-              <w:right w:w="100" w:type="dxa"/>
-            </w:tcMar>
-          </w:tcPr>
-          <w:p>
-            <w:pPr>
-              <w:spacing w:before="0" w:after="0"/>
-              <w:jc w:val="center"/>
-            </w:pPr>
-            <w:r>
-              <w:rPr>
-                <w:rFonts w:ascii="Calibri" w:hAnsi="Calibri" w:cs="Calibri" w:eastAsia="Calibri"/>
-                <w:b/>
-                <w:i w:val="0"/>
-                <w:color w:val="0F2A44"/>
-                <w:sz w:val="24"/>
-              </w:rPr>
-              <w:t>Tedarikçilerden Ürün Temini</w:t>
-            </w:r>
-          </w:p>
-        </w:tc>
-      </w:tr>
-      <w:tr>
-        <w:trPr>
-          <w:trHeight w:val="220" w:hRule="atLeast"/>
-          <w:cantSplit/>
-        </w:trPr>
-        <w:tc>
-          <w:tcPr>
-            <w:tcW w:type="dxa" w:w="8051"/>
-            <w:shd w:fill="FFFFFF" w:val="clear"/>
-            <w:tcBorders>
-              <w:top w:val="single" w:sz="2" w:space="0" w:color="FFFFFF"/>
-              <w:left w:val="single" w:sz="2" w:space="0" w:color="FFFFFF"/>
-              <w:bottom w:val="single" w:sz="2" w:space="0" w:color="FFFFFF"/>
-              <w:right w:val="single" w:sz="2" w:space="0" w:color="FFFFFF"/>
-            </w:tcBorders>
-            <w:vAlign w:val="center"/>
-            <w:tcMar>
-              <w:top w:w="60" w:type="dxa"/>
-              <w:left w:w="100" w:type="dxa"/>
-              <w:bottom w:w="60" w:type="dxa"/>
-              <w:right w:w="100" w:type="dxa"/>
-            </w:tcMar>
-          </w:tcPr>
-          <w:p>
-            <w:pPr>
-              <w:spacing w:before="0" w:after="0"/>
-              <w:jc w:val="center"/>
-            </w:pPr>
-            <w:r>
-              <w:rPr>
-                <w:rFonts w:ascii="Calibri" w:hAnsi="Calibri" w:cs="Calibri" w:eastAsia="Calibri"/>
-                <w:b/>
-                <w:i w:val="0"/>
-                <w:color w:val="334155"/>
-                <w:sz w:val="28"/>
-              </w:rPr>
-              <w:t>↓</w:t>
-            </w:r>
-          </w:p>
-        </w:tc>
-      </w:tr>
-      <w:tr>
-        <w:trPr>
-          <w:trHeight w:val="420" w:hRule="atLeast"/>
-          <w:cantSplit/>
-        </w:trPr>
-        <w:tc>
-          <w:tcPr>
-            <w:tcW w:type="dxa" w:w="8051"/>
-            <w:shd w:fill="E8F1FA" w:val="clear"/>
-            <w:tcBorders>
-              <w:top w:val="single" w:sz="12" w:space="0" w:color="1F4E79"/>
-              <w:left w:val="single" w:sz="12" w:space="0" w:color="1F4E79"/>
-              <w:bottom w:val="single" w:sz="12" w:space="0" w:color="1F4E79"/>
-              <w:right w:val="single" w:sz="12" w:space="0" w:color="1F4E79"/>
-            </w:tcBorders>
-            <w:vAlign w:val="center"/>
-            <w:tcMar>
-              <w:top w:w="60" w:type="dxa"/>
-              <w:left w:w="100" w:type="dxa"/>
-              <w:bottom w:w="60" w:type="dxa"/>
-              <w:right w:w="100" w:type="dxa"/>
-            </w:tcMar>
-          </w:tcPr>
-          <w:p>
-            <w:pPr>
-              <w:spacing w:before="0" w:after="0"/>
-              <w:jc w:val="center"/>
-            </w:pPr>
-            <w:r>
-              <w:rPr>
-                <w:rFonts w:ascii="Calibri" w:hAnsi="Calibri" w:cs="Calibri" w:eastAsia="Calibri"/>
-                <w:b/>
-                <w:i w:val="0"/>
-                <w:color w:val="0F2A44"/>
-                <w:sz w:val="24"/>
-              </w:rPr>
-              <w:t>Mal Kabul ve Kalite Kontrol</w:t>
-            </w:r>
-          </w:p>
-        </w:tc>
-      </w:tr>
-      <w:tr>
-        <w:trPr>
-          <w:trHeight w:val="220" w:hRule="atLeast"/>
-          <w:cantSplit/>
-        </w:trPr>
-        <w:tc>
-          <w:tcPr>
-            <w:tcW w:type="dxa" w:w="8051"/>
-            <w:shd w:fill="FFFFFF" w:val="clear"/>
-            <w:tcBorders>
-              <w:top w:val="single" w:sz="2" w:space="0" w:color="FFFFFF"/>
-              <w:left w:val="single" w:sz="2" w:space="0" w:color="FFFFFF"/>
-              <w:bottom w:val="single" w:sz="2" w:space="0" w:color="FFFFFF"/>
-              <w:right w:val="single" w:sz="2" w:space="0" w:color="FFFFFF"/>
-            </w:tcBorders>
-            <w:vAlign w:val="center"/>
-            <w:tcMar>
-              <w:top w:w="60" w:type="dxa"/>
-              <w:left w:w="100" w:type="dxa"/>
-              <w:bottom w:w="60" w:type="dxa"/>
-              <w:right w:w="100" w:type="dxa"/>
-            </w:tcMar>
-          </w:tcPr>
-          <w:p>
-            <w:pPr>
-              <w:spacing w:before="0" w:after="0"/>
-              <w:jc w:val="center"/>
-            </w:pPr>
-            <w:r>
-              <w:rPr>
-                <w:rFonts w:ascii="Calibri" w:hAnsi="Calibri" w:cs="Calibri" w:eastAsia="Calibri"/>
-                <w:b/>
-                <w:i w:val="0"/>
-                <w:color w:val="334155"/>
-                <w:sz w:val="28"/>
-              </w:rPr>
-              <w:t>↓</w:t>
-            </w:r>
-          </w:p>
-        </w:tc>
-      </w:tr>
-      <w:tr>
-        <w:trPr>
-          <w:trHeight w:val="420" w:hRule="atLeast"/>
-          <w:cantSplit/>
-        </w:trPr>
-        <w:tc>
-          <w:tcPr>
-            <w:tcW w:type="dxa" w:w="8051"/>
-            <w:shd w:fill="E8F1FA" w:val="clear"/>
-            <w:tcBorders>
-              <w:top w:val="single" w:sz="12" w:space="0" w:color="1F4E79"/>
-              <w:left w:val="single" w:sz="12" w:space="0" w:color="1F4E79"/>
-              <w:bottom w:val="single" w:sz="12" w:space="0" w:color="1F4E79"/>
-              <w:right w:val="single" w:sz="12" w:space="0" w:color="1F4E79"/>
-            </w:tcBorders>
-            <w:vAlign w:val="center"/>
-            <w:tcMar>
-              <w:top w:w="60" w:type="dxa"/>
-              <w:left w:w="100" w:type="dxa"/>
-              <w:bottom w:w="60" w:type="dxa"/>
-              <w:right w:w="100" w:type="dxa"/>
-            </w:tcMar>
-          </w:tcPr>
-          <w:p>
-            <w:pPr>
-              <w:spacing w:before="0" w:after="0"/>
-              <w:jc w:val="center"/>
-            </w:pPr>
-            <w:r>
-              <w:rPr>
-                <w:rFonts w:ascii="Calibri" w:hAnsi="Calibri" w:cs="Calibri" w:eastAsia="Calibri"/>
-                <w:b/>
-                <w:i w:val="0"/>
-                <w:color w:val="0F2A44"/>
-                <w:sz w:val="24"/>
-              </w:rPr>
-              <w:t>Depolama ve Stok Takibi</w:t>
-            </w:r>
-          </w:p>
-        </w:tc>
-      </w:tr>
-      <w:tr>
-        <w:trPr>
-          <w:trHeight w:val="220" w:hRule="atLeast"/>
-          <w:cantSplit/>
-        </w:trPr>
-        <w:tc>
-          <w:tcPr>
-            <w:tcW w:type="dxa" w:w="8051"/>
-            <w:shd w:fill="FFFFFF" w:val="clear"/>
-            <w:tcBorders>
-              <w:top w:val="single" w:sz="2" w:space="0" w:color="FFFFFF"/>
-              <w:left w:val="single" w:sz="2" w:space="0" w:color="FFFFFF"/>
-              <w:bottom w:val="single" w:sz="2" w:space="0" w:color="FFFFFF"/>
-              <w:right w:val="single" w:sz="2" w:space="0" w:color="FFFFFF"/>
-            </w:tcBorders>
-            <w:vAlign w:val="center"/>
-            <w:tcMar>
-              <w:top w:w="60" w:type="dxa"/>
-              <w:left w:w="100" w:type="dxa"/>
-              <w:bottom w:w="60" w:type="dxa"/>
-              <w:right w:w="100" w:type="dxa"/>
-            </w:tcMar>
-          </w:tcPr>
-          <w:p>
-            <w:pPr>
-              <w:spacing w:before="0" w:after="0"/>
-              <w:jc w:val="center"/>
-            </w:pPr>
-            <w:r>
-              <w:rPr>
-                <w:rFonts w:ascii="Calibri" w:hAnsi="Calibri" w:cs="Calibri" w:eastAsia="Calibri"/>
-                <w:b/>
-                <w:i w:val="0"/>
-                <w:color w:val="334155"/>
-                <w:sz w:val="28"/>
-              </w:rPr>
-              <w:t>↓</w:t>
-            </w:r>
-          </w:p>
-        </w:tc>
-      </w:tr>
-      <w:tr>
-        <w:trPr>
-          <w:trHeight w:val="420" w:hRule="atLeast"/>
-          <w:cantSplit/>
-        </w:trPr>
-        <w:tc>
-          <w:tcPr>
-            <w:tcW w:type="dxa" w:w="8051"/>
-            <w:shd w:fill="E8F1FA" w:val="clear"/>
-            <w:tcBorders>
-              <w:top w:val="single" w:sz="12" w:space="0" w:color="1F4E79"/>
-              <w:left w:val="single" w:sz="12" w:space="0" w:color="1F4E79"/>
-              <w:bottom w:val="single" w:sz="12" w:space="0" w:color="1F4E79"/>
-              <w:right w:val="single" w:sz="12" w:space="0" w:color="1F4E79"/>
-            </w:tcBorders>
-            <w:vAlign w:val="center"/>
-            <w:tcMar>
-              <w:top w:w="60" w:type="dxa"/>
-              <w:left w:w="100" w:type="dxa"/>
-              <w:bottom w:w="60" w:type="dxa"/>
-              <w:right w:w="100" w:type="dxa"/>
-            </w:tcMar>
-          </w:tcPr>
-          <w:p>
-            <w:pPr>
-              <w:spacing w:before="0" w:after="0"/>
-              <w:jc w:val="center"/>
-            </w:pPr>
-            <w:r>
-              <w:rPr>
-                <w:rFonts w:ascii="Calibri" w:hAnsi="Calibri" w:cs="Calibri" w:eastAsia="Calibri"/>
-                <w:b/>
-                <w:i w:val="0"/>
-                <w:color w:val="0F2A44"/>
-                <w:sz w:val="24"/>
-              </w:rPr>
-              <w:t>Sipariş Alınması</w:t>
-            </w:r>
-          </w:p>
-        </w:tc>
-      </w:tr>
-      <w:tr>
-        <w:trPr>
-          <w:trHeight w:val="220" w:hRule="atLeast"/>
-          <w:cantSplit/>
-        </w:trPr>
-        <w:tc>
-          <w:tcPr>
-            <w:tcW w:type="dxa" w:w="8051"/>
-            <w:shd w:fill="FFFFFF" w:val="clear"/>
-            <w:tcBorders>
-              <w:top w:val="single" w:sz="2" w:space="0" w:color="FFFFFF"/>
-              <w:left w:val="single" w:sz="2" w:space="0" w:color="FFFFFF"/>
-              <w:bottom w:val="single" w:sz="2" w:space="0" w:color="FFFFFF"/>
-              <w:right w:val="single" w:sz="2" w:space="0" w:color="FFFFFF"/>
-            </w:tcBorders>
-            <w:vAlign w:val="center"/>
-            <w:tcMar>
-              <w:top w:w="60" w:type="dxa"/>
-              <w:left w:w="100" w:type="dxa"/>
-              <w:bottom w:w="60" w:type="dxa"/>
-              <w:right w:w="100" w:type="dxa"/>
-            </w:tcMar>
-          </w:tcPr>
-          <w:p>
-            <w:pPr>
-              <w:spacing w:before="0" w:after="0"/>
-              <w:jc w:val="center"/>
-            </w:pPr>
-            <w:r>
-              <w:rPr>
-                <w:rFonts w:ascii="Calibri" w:hAnsi="Calibri" w:cs="Calibri" w:eastAsia="Calibri"/>
-                <w:b/>
-                <w:i w:val="0"/>
-                <w:color w:val="334155"/>
-                <w:sz w:val="28"/>
-              </w:rPr>
-              <w:t>↓</w:t>
-            </w:r>
-          </w:p>
-        </w:tc>
-      </w:tr>
-      <w:tr>
-        <w:trPr>
-          <w:trHeight w:val="420" w:hRule="atLeast"/>
-          <w:cantSplit/>
-        </w:trPr>
-        <w:tc>
-          <w:tcPr>
-            <w:tcW w:type="dxa" w:w="8051"/>
-            <w:shd w:fill="E8F1FA" w:val="clear"/>
-            <w:tcBorders>
-              <w:top w:val="single" w:sz="12" w:space="0" w:color="1F4E79"/>
-              <w:left w:val="single" w:sz="12" w:space="0" w:color="1F4E79"/>
-              <w:bottom w:val="single" w:sz="12" w:space="0" w:color="1F4E79"/>
-              <w:right w:val="single" w:sz="12" w:space="0" w:color="1F4E79"/>
-            </w:tcBorders>
-            <w:vAlign w:val="center"/>
-            <w:tcMar>
-              <w:top w:w="60" w:type="dxa"/>
-              <w:left w:w="100" w:type="dxa"/>
-              <w:bottom w:w="60" w:type="dxa"/>
-              <w:right w:w="100" w:type="dxa"/>
-            </w:tcMar>
-          </w:tcPr>
-          <w:p>
-            <w:pPr>
-              <w:spacing w:before="0" w:after="0"/>
-              <w:jc w:val="center"/>
-            </w:pPr>
-            <w:r>
-              <w:rPr>
-                <w:rFonts w:ascii="Calibri" w:hAnsi="Calibri" w:cs="Calibri" w:eastAsia="Calibri"/>
-                <w:b/>
-                <w:i w:val="0"/>
-                <w:color w:val="0F2A44"/>
-                <w:sz w:val="24"/>
-              </w:rPr>
-              <w:t>Sipariş Hazırlama</w:t>
-            </w:r>
-          </w:p>
-        </w:tc>
-      </w:tr>
-      <w:tr>
-        <w:trPr>
-          <w:trHeight w:val="220" w:hRule="atLeast"/>
-          <w:cantSplit/>
-        </w:trPr>
-        <w:tc>
-          <w:tcPr>
-            <w:tcW w:type="dxa" w:w="8051"/>
-            <w:shd w:fill="FFFFFF" w:val="clear"/>
-            <w:tcBorders>
-              <w:top w:val="single" w:sz="2" w:space="0" w:color="FFFFFF"/>
-              <w:left w:val="single" w:sz="2" w:space="0" w:color="FFFFFF"/>
-              <w:bottom w:val="single" w:sz="2" w:space="0" w:color="FFFFFF"/>
-              <w:right w:val="single" w:sz="2" w:space="0" w:color="FFFFFF"/>
-            </w:tcBorders>
-            <w:vAlign w:val="center"/>
-            <w:tcMar>
-              <w:top w:w="60" w:type="dxa"/>
-              <w:left w:w="100" w:type="dxa"/>
-              <w:bottom w:w="60" w:type="dxa"/>
-              <w:right w:w="100" w:type="dxa"/>
-            </w:tcMar>
-          </w:tcPr>
-          <w:p>
-            <w:pPr>
-              <w:spacing w:before="0" w:after="0"/>
-              <w:jc w:val="center"/>
-            </w:pPr>
-            <w:r>
-              <w:rPr>
-                <w:rFonts w:ascii="Calibri" w:hAnsi="Calibri" w:cs="Calibri" w:eastAsia="Calibri"/>
-                <w:b/>
-                <w:i w:val="0"/>
-                <w:color w:val="334155"/>
-                <w:sz w:val="28"/>
-              </w:rPr>
-              <w:t>↓</w:t>
-            </w:r>
-          </w:p>
-        </w:tc>
-      </w:tr>
-      <w:tr>
-        <w:trPr>
-          <w:trHeight w:val="420" w:hRule="atLeast"/>
-          <w:cantSplit/>
-        </w:trPr>
-        <w:tc>
-          <w:tcPr>
-            <w:tcW w:type="dxa" w:w="8051"/>
-            <w:shd w:fill="E8F1FA" w:val="clear"/>
-            <w:tcBorders>
-              <w:top w:val="single" w:sz="12" w:space="0" w:color="1F4E79"/>
-              <w:left w:val="single" w:sz="12" w:space="0" w:color="1F4E79"/>
-              <w:bottom w:val="single" w:sz="12" w:space="0" w:color="1F4E79"/>
-              <w:right w:val="single" w:sz="12" w:space="0" w:color="1F4E79"/>
-            </w:tcBorders>
-            <w:vAlign w:val="center"/>
-            <w:tcMar>
-              <w:top w:w="60" w:type="dxa"/>
-              <w:left w:w="100" w:type="dxa"/>
-              <w:bottom w:w="60" w:type="dxa"/>
-              <w:right w:w="100" w:type="dxa"/>
-            </w:tcMar>
-          </w:tcPr>
-          <w:p>
-            <w:pPr>
-              <w:spacing w:before="0" w:after="0"/>
-              <w:jc w:val="center"/>
-            </w:pPr>
-            <w:r>
-              <w:rPr>
-                <w:rFonts w:ascii="Calibri" w:hAnsi="Calibri" w:cs="Calibri" w:eastAsia="Calibri"/>
-                <w:b/>
-                <w:i w:val="0"/>
-                <w:color w:val="0F2A44"/>
-                <w:sz w:val="24"/>
-              </w:rPr>
-              <w:t>Sevkiyat ve Dağıtım</w:t>
-            </w:r>
-          </w:p>
-        </w:tc>
-      </w:tr>
-      <w:tr>
-        <w:trPr>
-          <w:trHeight w:val="220" w:hRule="atLeast"/>
-          <w:cantSplit/>
-        </w:trPr>
-        <w:tc>
-          <w:tcPr>
-            <w:tcW w:type="dxa" w:w="8051"/>
-            <w:shd w:fill="FFFFFF" w:val="clear"/>
-            <w:tcBorders>
-              <w:top w:val="single" w:sz="2" w:space="0" w:color="FFFFFF"/>
-              <w:left w:val="single" w:sz="2" w:space="0" w:color="FFFFFF"/>
-              <w:bottom w:val="single" w:sz="2" w:space="0" w:color="FFFFFF"/>
-              <w:right w:val="single" w:sz="2" w:space="0" w:color="FFFFFF"/>
-            </w:tcBorders>
-            <w:vAlign w:val="center"/>
-            <w:tcMar>
-              <w:top w:w="60" w:type="dxa"/>
-              <w:left w:w="100" w:type="dxa"/>
-              <w:bottom w:w="60" w:type="dxa"/>
-              <w:right w:w="100" w:type="dxa"/>
-            </w:tcMar>
-          </w:tcPr>
-          <w:p>
-            <w:pPr>
-              <w:spacing w:before="0" w:after="0"/>
-              <w:jc w:val="center"/>
-            </w:pPr>
-            <w:r>
-              <w:rPr>
-                <w:rFonts w:ascii="Calibri" w:hAnsi="Calibri" w:cs="Calibri" w:eastAsia="Calibri"/>
-                <w:b/>
-                <w:i w:val="0"/>
-                <w:color w:val="334155"/>
-                <w:sz w:val="28"/>
-              </w:rPr>
-              <w:t>↓</w:t>
-            </w:r>
-          </w:p>
-        </w:tc>
-      </w:tr>
-      <w:tr>
-        <w:trPr>
-          <w:trHeight w:val="420" w:hRule="atLeast"/>
-          <w:cantSplit/>
-        </w:trPr>
-        <w:tc>
-          <w:tcPr>
-            <w:tcW w:type="dxa" w:w="8051"/>
-            <w:shd w:fill="E8F1FA" w:val="clear"/>
-            <w:tcBorders>
-              <w:top w:val="single" w:sz="12" w:space="0" w:color="1F4E79"/>
-              <w:left w:val="single" w:sz="12" w:space="0" w:color="1F4E79"/>
-              <w:bottom w:val="single" w:sz="12" w:space="0" w:color="1F4E79"/>
-              <w:right w:val="single" w:sz="12" w:space="0" w:color="1F4E79"/>
-            </w:tcBorders>
-            <w:vAlign w:val="center"/>
-            <w:tcMar>
-              <w:top w:w="60" w:type="dxa"/>
-              <w:left w:w="100" w:type="dxa"/>
-              <w:bottom w:w="60" w:type="dxa"/>
-              <w:right w:w="100" w:type="dxa"/>
-            </w:tcMar>
-          </w:tcPr>
-          <w:p>
-            <w:pPr>
-              <w:spacing w:before="0" w:after="0"/>
-              <w:jc w:val="center"/>
-            </w:pPr>
-            <w:r>
-              <w:rPr>
-                <w:rFonts w:ascii="Calibri" w:hAnsi="Calibri" w:cs="Calibri" w:eastAsia="Calibri"/>
-                <w:b/>
-                <w:i w:val="0"/>
-                <w:color w:val="0F2A44"/>
-                <w:sz w:val="24"/>
-              </w:rPr>
-              <w:t>Müşteriye Teslimat</w:t>
-            </w:r>
-          </w:p>
-        </w:tc>
-      </w:tr>
-      <w:tr>
-        <w:trPr>
-          <w:trHeight w:val="220" w:hRule="atLeast"/>
-          <w:cantSplit/>
-        </w:trPr>
-        <w:tc>
-          <w:tcPr>
-            <w:tcW w:type="dxa" w:w="8051"/>
-            <w:shd w:fill="FFFFFF" w:val="clear"/>
-            <w:tcBorders>
-              <w:top w:val="single" w:sz="2" w:space="0" w:color="FFFFFF"/>
-              <w:left w:val="single" w:sz="2" w:space="0" w:color="FFFFFF"/>
-              <w:bottom w:val="single" w:sz="2" w:space="0" w:color="FFFFFF"/>
-              <w:right w:val="single" w:sz="2" w:space="0" w:color="FFFFFF"/>
-            </w:tcBorders>
-            <w:vAlign w:val="center"/>
-            <w:tcMar>
-              <w:top w:w="60" w:type="dxa"/>
-              <w:left w:w="100" w:type="dxa"/>
-              <w:bottom w:w="60" w:type="dxa"/>
-              <w:right w:w="100" w:type="dxa"/>
-            </w:tcMar>
-          </w:tcPr>
-          <w:p>
-            <w:pPr>
-              <w:spacing w:before="0" w:after="0"/>
-              <w:jc w:val="center"/>
-            </w:pPr>
-            <w:r>
-              <w:rPr>
-                <w:rFonts w:ascii="Calibri" w:hAnsi="Calibri" w:cs="Calibri" w:eastAsia="Calibri"/>
-                <w:b/>
-                <w:i w:val="0"/>
-                <w:color w:val="334155"/>
-                <w:sz w:val="28"/>
-              </w:rPr>
-              <w:t>↓</w:t>
-            </w:r>
-          </w:p>
-        </w:tc>
-      </w:tr>
-      <w:tr>
-        <w:trPr>
-          <w:trHeight w:val="420" w:hRule="atLeast"/>
-          <w:cantSplit/>
-        </w:trPr>
-        <w:tc>
-          <w:tcPr>
-            <w:tcW w:type="dxa" w:w="8051"/>
-            <w:shd w:fill="E8F1FA" w:val="clear"/>
-            <w:tcBorders>
-              <w:top w:val="single" w:sz="12" w:space="0" w:color="1F4E79"/>
-              <w:left w:val="single" w:sz="12" w:space="0" w:color="1F4E79"/>
-              <w:bottom w:val="single" w:sz="12" w:space="0" w:color="1F4E79"/>
-              <w:right w:val="single" w:sz="12" w:space="0" w:color="1F4E79"/>
-            </w:tcBorders>
-            <w:vAlign w:val="center"/>
-            <w:tcMar>
-              <w:top w:w="60" w:type="dxa"/>
-              <w:left w:w="100" w:type="dxa"/>
-              <w:bottom w:w="60" w:type="dxa"/>
-              <w:right w:w="100" w:type="dxa"/>
-            </w:tcMar>
-          </w:tcPr>
-          <w:p>
-            <w:pPr>
-              <w:spacing w:before="0" w:after="0"/>
-              <w:jc w:val="center"/>
-            </w:pPr>
-            <w:r>
-              <w:rPr>
-                <w:rFonts w:ascii="Calibri" w:hAnsi="Calibri" w:cs="Calibri" w:eastAsia="Calibri"/>
-                <w:b/>
-                <w:i w:val="0"/>
-                <w:color w:val="0F2A44"/>
-                <w:sz w:val="24"/>
-              </w:rPr>
-              <w:t>Satış Sonrası Destek ve İade İşlemleri</w:t>
-            </w:r>
-          </w:p>
-        </w:tc>
-      </w:tr>
-    </w:tbl>
-    <w:p>
-      <w:pPr>
-        <w:spacing w:before="200" w:after="0" w:line="240" w:lineRule="auto"/>
-        <w:jc w:val="center"/>
-      </w:pPr>
-      <w:r>
-        <w:rPr>
-          <w:rFonts w:ascii="Calibri" w:hAnsi="Calibri" w:cs="Calibri" w:eastAsia="Calibri"/>
-          <w:b w:val="0"/>
-          <w:i/>
-          <w:color w:val="475569"/>
-          <w:sz w:val="20"/>
-        </w:rPr>
-        <w:t>Faaliyette üretim yoktur. Akış; tedarik, mal kabul, depolama, sipariş, sevkiyat ve satış sonrası işlemlerden oluşur.</w:t>
+        <w:drawing>
+          <wp:inline xmlns:a="http://schemas.openxmlformats.org/drawingml/2006/main" xmlns:pic="http://schemas.openxmlformats.org/drawingml/2006/picture">
+            <wp:extent cx="5940000" cy="5959800"/>
+            <wp:docPr id="1" name="Picture 1"/>
+            <wp:cNvGraphicFramePr>
+              <a:graphicFrameLocks noChangeAspect="1"/>
+            </wp:cNvGraphicFramePr>
+            <a:graphic>
+              <a:graphicData uri="http://schemas.openxmlformats.org/drawingml/2006/picture">
+                <pic:pic>
+                  <pic:nvPicPr>
+                    <pic:cNvPr id="0" name="merlas-sema.png"/>
+                    <pic:cNvPicPr/>
+                  </pic:nvPicPr>
+                  <pic:blipFill>
+                    <a:blip r:embed="rId10"/>
+                    <a:stretch>
+                      <a:fillRect/>
+                    </a:stretch>
+                  </pic:blipFill>
+                  <pic:spPr>
+                    <a:xfrm>
+                      <a:off x="0" y="0"/>
+                      <a:ext cx="5940000" cy="5959800"/>
+                    </a:xfrm>
+                    <a:prstGeom prst="rect"/>
+                  </pic:spPr>
+                </pic:pic>
+              </a:graphicData>
+            </a:graphic>
+          </wp:inline>
+        </w:drawing>
       </w:r>
     </w:p>
     <w:sectPr>
-      <w:headerReference w:type="default" r:id="rId9"/>
-      <w:footerReference w:type="default" r:id="rId10"/>
+      <w:footerReference w:type="default" r:id="rId9"/>
       <w:pgSz w:w="11906" w:h="16838"/>
-      <w:pgMar w:top="709" w:right="964" w:bottom="709" w:left="964" w:header="283" w:footer="283" w:gutter="0"/>
+      <w:pgMar w:top="850" w:right="1020" w:bottom="794" w:left="1020" w:header="720" w:footer="720" w:gutter="0"/>
       <w:cols w:space="720"/>
       <w:docGrid w:linePitch="360"/>
     </w:sectPr>
@@ -1484,25 +745,14 @@
   <w:p>
     <w:pPr>
       <w:pStyle w:val="Footer"/>
-      <w:jc w:val="left"/>
+      <w:jc w:val="right"/>
     </w:pPr>
     <w:r>
       <w:rPr>
-        <w:rFonts w:ascii="Calibri" w:hAnsi="Calibri" w:cs="Calibri" w:eastAsia="Calibri"/>
+        <w:rFonts w:ascii="Times New Roman" w:hAnsi="Times New Roman" w:cs="Times New Roman" w:eastAsia="Times New Roman"/>
         <w:b w:val="0"/>
-        <w:i w:val="0"/>
-        <w:color w:val="64748B"/>
-        <w:sz w:val="16"/>
-      </w:rPr>
-      <w:t xml:space="preserve">İş Akım Şeması ve Proses Özeti  ·  Kaynak: İç tetkik raporu (02.01.2026)          </w:t>
-    </w:r>
-    <w:r>
-      <w:rPr>
-        <w:rFonts w:ascii="Calibri" w:hAnsi="Calibri" w:cs="Calibri" w:eastAsia="Calibri"/>
-        <w:b w:val="0"/>
-        <w:i w:val="0"/>
-        <w:color w:val="64748B"/>
-        <w:sz w:val="16"/>
+        <w:color w:val="000000"/>
+        <w:sz w:val="22"/>
       </w:rPr>
       <w:fldChar w:fldCharType="begin"/>
       <w:instrText xml:space="preserve"> PAGE </w:instrText>
@@ -1510,27 +760,6 @@
     </w:r>
   </w:p>
 </w:ftr>
-</file>
-
-<file path=word/header1.xml><?xml version="1.0" encoding="utf-8"?>
-<w:hdr xmlns:m="http://schemas.openxmlformats.org/officeDocument/2006/math" xmlns:mc="http://schemas.openxmlformats.org/markup-compatibility/2006" xmlns:mo="http://schemas.microsoft.com/office/mac/office/2008/main" xmlns:mv="urn:schemas-microsoft-com:mac:vml" xmlns:o="urn:schemas-microsoft-com:office:office" xmlns:r="http://schemas.openxmlformats.org/officeDocument/2006/relationships" xmlns:v="urn:schemas-microsoft-com:vml" xmlns:w10="urn:schemas-microsoft-com:office:word" xmlns:w14="http://schemas.microsoft.com/office/word/2010/wordml" xmlns:w="http://schemas.openxmlformats.org/wordprocessingml/2006/main" xmlns:wne="http://schemas.microsoft.com/office/word/2006/wordml" xmlns:wp14="http://schemas.microsoft.com/office/word/2010/wordprocessingDrawing" xmlns:wp="http://schemas.openxmlformats.org/drawingml/2006/wordprocessingDrawing" xmlns:wpc="http://schemas.microsoft.com/office/word/2010/wordprocessingCanvas" xmlns:wpg="http://schemas.microsoft.com/office/word/2010/wordprocessingGroup" xmlns:wpi="http://schemas.microsoft.com/office/word/2010/wordprocessingInk" xmlns:wps="http://schemas.microsoft.com/office/word/2010/wordprocessingShape" mc:Ignorable="w14 wp14">
-  <w:p>
-    <w:pPr>
-      <w:pStyle w:val="Header"/>
-      <w:jc w:val="right"/>
-    </w:pPr>
-    <w:r>
-      <w:rPr>
-        <w:rFonts w:ascii="Calibri" w:hAnsi="Calibri" w:cs="Calibri" w:eastAsia="Calibri"/>
-        <w:b/>
-        <w:i w:val="0"/>
-        <w:color w:val="0F2A44"/>
-        <w:sz w:val="18"/>
-      </w:rPr>
-      <w:t>MERLAS OTO LASTİK ENDÜSTRİ SANAYİ VE TİCARET LİMİTED ŞİRKETİ</w:t>
-    </w:r>
-  </w:p>
-</w:hdr>
 </file>
 
 <file path=word/numbering.xml><?xml version="1.0" encoding="utf-8"?>

</xml_diff>